<commit_message>
Carry the corrected S4/S7a baseline back into the design and audit docs
02's step table still carried the shorthand from before the code check --
S4's initial content and S7a's baseline described as the target surfaces
alone. The verified content is whatever that prior level actually supplied:
target surfaces plus ground plus any environment kept at that level. 07
already said this; 02, 01 and 06 now agree. 01 is the Phase 1 record written
before the check, so its original wording stays with a pointer to 09 rather
than being rewritten after the fact.

00A counted 15 fixes in doc 10, which reached 21 once this round's six landed.

Two more of the same class, flagged last message: doc 04's 3.2 heading said
the cost basically disappears while its own body says it shrank and stayed
significant, and a stale parenthetical repeated the E3b caveat.

Text only -- no number, experiment or algorithm touched.

Co-Authored-By: Claude Opus 5 <noreply@anthropic.com>
</commit_message>
<xml_diff>
--- a/交付_20260811_规划环境先验解耦/01_完整模型先验依赖审计_FINAL.docx
+++ b/交付_20260811_规划环境先验解耦/01_完整模型先验依赖审计_FINAL.docx
@@ -2604,14 +2604,14 @@
         <w:rPr>
           <w:rFonts w:ascii="SimSun" w:hAnsi="SimSun" w:eastAsia="SimSun"/>
         </w:rPr>
-        <w:t>若基准改为"仅目标表面"，同一判据的语义自然变成"</w:t>
+        <w:t>若基准改为不含非目标环境的那份几何，同一判据的语义自然变成"</w:t>
       </w:r>
       <w:r>
         <w:rPr>
           <w:rFonts w:ascii="SimSun" w:hAnsi="SimSun" w:eastAsia="SimSun"/>
           <w:b/>
         </w:rPr>
-        <w:t>当前参考模型未描述的环境几何</w:t>
+        <w:t>规划环境模型遮挡侧初始内容未描述的环境几何</w:t>
       </w:r>
       <w:r>
         <w:rPr>
@@ -2638,6 +2638,86 @@
           <w:b/>
         </w:rPr>
         <w:t>[B]</w:t>
+      </w:r>
+    </w:p>
+    <w:p>
+      <w:pPr>
+        <w:ind w:left="360"/>
+      </w:pPr>
+      <w:r>
+        <w:rPr>
+          <w:rFonts w:ascii="SimSun" w:hAnsi="SimSun" w:eastAsia="SimSun"/>
+          <w:b/>
+          <w:i/>
+        </w:rPr>
+        <w:t>本文件是 Phase 1 的核查记录（写于代码事实核查之前）。</w:t>
+      </w:r>
+      <w:r>
+        <w:rPr>
+          <w:rFonts w:ascii="SimSun" w:hAnsi="SimSun" w:eastAsia="SimSun"/>
+          <w:i/>
+        </w:rPr>
+        <w:t xml:space="preserve"> 实现落地后的准确基准是</w:t>
+      </w:r>
+      <w:r>
+        <w:rPr>
+          <w:rFonts w:ascii="Consolas" w:hAnsi="Consolas" w:eastAsia="Consolas"/>
+          <w:i/>
+          <w:sz w:val="18"/>
+        </w:rPr>
+        <w:t>world.ref_tris</w:t>
+      </w:r>
+      <w:r>
+        <w:rPr>
+          <w:rFonts w:ascii="SimSun" w:hAnsi="SimSun" w:eastAsia="SimSun"/>
+          <w:i/>
+        </w:rPr>
+        <w:t>，即</w:t>
+      </w:r>
+      <w:r>
+        <w:rPr>
+          <w:rFonts w:ascii="SimSun" w:hAnsi="SimSun" w:eastAsia="SimSun"/>
+          <w:b/>
+          <w:i/>
+        </w:rPr>
+        <w:t>该先验档实际提供的 M_vis 初始内容</w:t>
+      </w:r>
+      <w:r>
+        <w:rPr>
+          <w:rFonts w:ascii="SimSun" w:hAnsi="SimSun" w:eastAsia="SimSun"/>
+          <w:i/>
+        </w:rPr>
+        <w:t>（M_ref 目标表面 ＋ 地面 ＋该档保留的环境构件），</w:t>
+      </w:r>
+      <w:r>
+        <w:rPr>
+          <w:rFonts w:ascii="SimSun" w:hAnsi="SimSun" w:eastAsia="SimSun"/>
+          <w:b/>
+          <w:i/>
+        </w:rPr>
+        <w:t>不是"仅目标表面"</w:t>
+      </w:r>
+      <w:r>
+        <w:rPr>
+          <w:rFonts w:ascii="SimSun" w:hAnsi="SimSun" w:eastAsia="SimSun"/>
+          <w:i/>
+        </w:rPr>
+        <w:t>。以</w:t>
+      </w:r>
+      <w:r>
+        <w:rPr>
+          <w:rFonts w:ascii="Consolas" w:hAnsi="Consolas" w:eastAsia="Consolas"/>
+          <w:i/>
+          <w:sz w:val="18"/>
+        </w:rPr>
+        <w:t>09_剩余代码逻辑核查_FINAL.md</w:t>
+      </w:r>
+      <w:r>
+        <w:rPr>
+          <w:rFonts w:ascii="SimSun" w:hAnsi="SimSun" w:eastAsia="SimSun"/>
+          <w:i/>
+        </w:rPr>
+        <w:t xml:space="preserve"> 核查一为准。</w:t>
       </w:r>
     </w:p>
     <w:p>

</xml_diff>